<commit_message>
Show negative tests as handled rejections instead of SQL*Plus errors
Wrap every statement that must fail (constraint tests, trigger tests and
business-rule checks) in a BEGIN ... EXCEPTION block that prints
'Rejected:' and the first line of the Oracle error, so the screenshots no
longer show 'ERROR at line 1' blocks. Re-captured all screenshots on Oracle.

Co-Authored-By: Claude Opus 5.5 <noreply@anthropic.com>
Claude-Session: https://claude.ai/code/session_01YVULFHd9Z5vNQ4W3qyWM67
</commit_message>
<xml_diff>
--- a/review2/Review2_Screenshot_Checklist.docx
+++ b/review2/Review2_Screenshot_Checklist.docx
@@ -1611,18 +1611,73 @@
                 <w:color w:val="222428"/>
                 <w:sz w:val="14"/>
               </w:rPr>
-              <w:t>INSERT INTO vehicle (vehicle_id, reg_number, brand, model, fuel_type, category_id, branch_id)</w:t>
-              <w:br/>
-            </w:r>
-            <w:r>
-              <w:rPr>
-                <w:rFonts w:ascii="Consolas" w:hAnsi="Consolas" w:eastAsia="Consolas"/>
-                <w:b w:val="0"/>
-                <w:i w:val="0"/>
-                <w:color w:val="222428"/>
-                <w:sz w:val="14"/>
-              </w:rPr>
-              <w:t>VALUES (50, 'TN09AB1001', 'Maruti Suzuki', 'Baleno', 'PETROL', 1, 1);</w:t>
+              <w:t>BEGIN</w:t>
+              <w:br/>
+            </w:r>
+            <w:r>
+              <w:rPr>
+                <w:rFonts w:ascii="Consolas" w:hAnsi="Consolas" w:eastAsia="Consolas"/>
+                <w:b w:val="0"/>
+                <w:i w:val="0"/>
+                <w:color w:val="222428"/>
+                <w:sz w:val="14"/>
+              </w:rPr>
+              <w:t xml:space="preserve">  INSERT INTO vehicle (vehicle_id, reg_number, brand, model, fuel_type, category_id, branch_id)</w:t>
+              <w:br/>
+            </w:r>
+            <w:r>
+              <w:rPr>
+                <w:rFonts w:ascii="Consolas" w:hAnsi="Consolas" w:eastAsia="Consolas"/>
+                <w:b w:val="0"/>
+                <w:i w:val="0"/>
+                <w:color w:val="222428"/>
+                <w:sz w:val="14"/>
+              </w:rPr>
+              <w:t xml:space="preserve">  VALUES (50, 'TN09AB1001', 'Maruti Suzuki', 'Baleno', 'PETROL', 1, 1);</w:t>
+              <w:br/>
+            </w:r>
+            <w:r>
+              <w:rPr>
+                <w:rFonts w:ascii="Consolas" w:hAnsi="Consolas" w:eastAsia="Consolas"/>
+                <w:b w:val="0"/>
+                <w:i w:val="0"/>
+                <w:color w:val="222428"/>
+                <w:sz w:val="14"/>
+              </w:rPr>
+              <w:t xml:space="preserve">  DBMS_OUTPUT.PUT_LINE('Accepted - constraint NOT working');</w:t>
+              <w:br/>
+            </w:r>
+            <w:r>
+              <w:rPr>
+                <w:rFonts w:ascii="Consolas" w:hAnsi="Consolas" w:eastAsia="Consolas"/>
+                <w:b w:val="0"/>
+                <w:i w:val="0"/>
+                <w:color w:val="222428"/>
+                <w:sz w:val="14"/>
+              </w:rPr>
+              <w:t>EXCEPTION WHEN OTHERS THEN DBMS_OUTPUT.PUT_LINE('Rejected: ' || REGEXP_SUBSTR(SQLERRM, '[^' || CHR(10) || ']+'));</w:t>
+              <w:br/>
+            </w:r>
+            <w:r>
+              <w:rPr>
+                <w:rFonts w:ascii="Consolas" w:hAnsi="Consolas" w:eastAsia="Consolas"/>
+                <w:b w:val="0"/>
+                <w:i w:val="0"/>
+                <w:color w:val="222428"/>
+                <w:sz w:val="14"/>
+              </w:rPr>
+              <w:t>END;</w:t>
+              <w:br/>
+            </w:r>
+            <w:r>
+              <w:rPr>
+                <w:rFonts w:ascii="Consolas" w:hAnsi="Consolas" w:eastAsia="Consolas"/>
+                <w:b w:val="0"/>
+                <w:i w:val="0"/>
+                <w:color w:val="222428"/>
+                <w:sz w:val="14"/>
+              </w:rPr>
+              <w:t>/</w:t>
               <w:br/>
             </w:r>
             <w:r>
@@ -1644,18 +1699,73 @@
                 <w:color w:val="222428"/>
                 <w:sz w:val="14"/>
               </w:rPr>
-              <w:t>INSERT INTO vehicle (vehicle_id, reg_number, brand, model, fuel_type, category_id, branch_id)</w:t>
-              <w:br/>
-            </w:r>
-            <w:r>
-              <w:rPr>
-                <w:rFonts w:ascii="Consolas" w:hAnsi="Consolas" w:eastAsia="Consolas"/>
-                <w:b w:val="0"/>
-                <w:i w:val="0"/>
-                <w:color w:val="222428"/>
-                <w:sz w:val="14"/>
-              </w:rPr>
-              <w:t>VALUES (51, 'TN09ZZ9999', 'Toyota', 'Hyryder', 'HYBRID', 3, 1);</w:t>
+              <w:t>BEGIN</w:t>
+              <w:br/>
+            </w:r>
+            <w:r>
+              <w:rPr>
+                <w:rFonts w:ascii="Consolas" w:hAnsi="Consolas" w:eastAsia="Consolas"/>
+                <w:b w:val="0"/>
+                <w:i w:val="0"/>
+                <w:color w:val="222428"/>
+                <w:sz w:val="14"/>
+              </w:rPr>
+              <w:t xml:space="preserve">  INSERT INTO vehicle (vehicle_id, reg_number, brand, model, fuel_type, category_id, branch_id)</w:t>
+              <w:br/>
+            </w:r>
+            <w:r>
+              <w:rPr>
+                <w:rFonts w:ascii="Consolas" w:hAnsi="Consolas" w:eastAsia="Consolas"/>
+                <w:b w:val="0"/>
+                <w:i w:val="0"/>
+                <w:color w:val="222428"/>
+                <w:sz w:val="14"/>
+              </w:rPr>
+              <w:t xml:space="preserve">  VALUES (51, 'TN09ZZ9999', 'Toyota', 'Hyryder', 'HYBRID', 3, 1);</w:t>
+              <w:br/>
+            </w:r>
+            <w:r>
+              <w:rPr>
+                <w:rFonts w:ascii="Consolas" w:hAnsi="Consolas" w:eastAsia="Consolas"/>
+                <w:b w:val="0"/>
+                <w:i w:val="0"/>
+                <w:color w:val="222428"/>
+                <w:sz w:val="14"/>
+              </w:rPr>
+              <w:t xml:space="preserve">  DBMS_OUTPUT.PUT_LINE('Accepted - constraint NOT working');</w:t>
+              <w:br/>
+            </w:r>
+            <w:r>
+              <w:rPr>
+                <w:rFonts w:ascii="Consolas" w:hAnsi="Consolas" w:eastAsia="Consolas"/>
+                <w:b w:val="0"/>
+                <w:i w:val="0"/>
+                <w:color w:val="222428"/>
+                <w:sz w:val="14"/>
+              </w:rPr>
+              <w:t>EXCEPTION WHEN OTHERS THEN DBMS_OUTPUT.PUT_LINE('Rejected: ' || REGEXP_SUBSTR(SQLERRM, '[^' || CHR(10) || ']+'));</w:t>
+              <w:br/>
+            </w:r>
+            <w:r>
+              <w:rPr>
+                <w:rFonts w:ascii="Consolas" w:hAnsi="Consolas" w:eastAsia="Consolas"/>
+                <w:b w:val="0"/>
+                <w:i w:val="0"/>
+                <w:color w:val="222428"/>
+                <w:sz w:val="14"/>
+              </w:rPr>
+              <w:t>END;</w:t>
+              <w:br/>
+            </w:r>
+            <w:r>
+              <w:rPr>
+                <w:rFonts w:ascii="Consolas" w:hAnsi="Consolas" w:eastAsia="Consolas"/>
+                <w:b w:val="0"/>
+                <w:i w:val="0"/>
+                <w:color w:val="222428"/>
+                <w:sz w:val="14"/>
+              </w:rPr>
+              <w:t>/</w:t>
               <w:br/>
             </w:r>
             <w:r>
@@ -1677,7 +1787,62 @@
                 <w:color w:val="222428"/>
                 <w:sz w:val="14"/>
               </w:rPr>
-              <w:t>INSERT INTO branch VALUES (50, 'DriveEase Test', 'Chennai', 'Test address', '98401', NULL);</w:t>
+              <w:t>BEGIN</w:t>
+              <w:br/>
+            </w:r>
+            <w:r>
+              <w:rPr>
+                <w:rFonts w:ascii="Consolas" w:hAnsi="Consolas" w:eastAsia="Consolas"/>
+                <w:b w:val="0"/>
+                <w:i w:val="0"/>
+                <w:color w:val="222428"/>
+                <w:sz w:val="14"/>
+              </w:rPr>
+              <w:t xml:space="preserve">  INSERT INTO branch VALUES (50, 'DriveEase Test', 'Chennai', 'Test address', '98401', NULL);</w:t>
+              <w:br/>
+            </w:r>
+            <w:r>
+              <w:rPr>
+                <w:rFonts w:ascii="Consolas" w:hAnsi="Consolas" w:eastAsia="Consolas"/>
+                <w:b w:val="0"/>
+                <w:i w:val="0"/>
+                <w:color w:val="222428"/>
+                <w:sz w:val="14"/>
+              </w:rPr>
+              <w:t xml:space="preserve">  DBMS_OUTPUT.PUT_LINE('Accepted - constraint NOT working');</w:t>
+              <w:br/>
+            </w:r>
+            <w:r>
+              <w:rPr>
+                <w:rFonts w:ascii="Consolas" w:hAnsi="Consolas" w:eastAsia="Consolas"/>
+                <w:b w:val="0"/>
+                <w:i w:val="0"/>
+                <w:color w:val="222428"/>
+                <w:sz w:val="14"/>
+              </w:rPr>
+              <w:t>EXCEPTION WHEN OTHERS THEN DBMS_OUTPUT.PUT_LINE('Rejected: ' || REGEXP_SUBSTR(SQLERRM, '[^' || CHR(10) || ']+'));</w:t>
+              <w:br/>
+            </w:r>
+            <w:r>
+              <w:rPr>
+                <w:rFonts w:ascii="Consolas" w:hAnsi="Consolas" w:eastAsia="Consolas"/>
+                <w:b w:val="0"/>
+                <w:i w:val="0"/>
+                <w:color w:val="222428"/>
+                <w:sz w:val="14"/>
+              </w:rPr>
+              <w:t>END;</w:t>
+              <w:br/>
+            </w:r>
+            <w:r>
+              <w:rPr>
+                <w:rFonts w:ascii="Consolas" w:hAnsi="Consolas" w:eastAsia="Consolas"/>
+                <w:b w:val="0"/>
+                <w:i w:val="0"/>
+                <w:color w:val="222428"/>
+                <w:sz w:val="14"/>
+              </w:rPr>
+              <w:t>/</w:t>
               <w:br/>
             </w:r>
             <w:r>
@@ -1699,18 +1864,73 @@
                 <w:color w:val="222428"/>
                 <w:sz w:val="14"/>
               </w:rPr>
-              <w:t>INSERT INTO customer (customer_id, name, phone, license_expiry, dob)</w:t>
-              <w:br/>
-            </w:r>
-            <w:r>
-              <w:rPr>
-                <w:rFonts w:ascii="Consolas" w:hAnsi="Consolas" w:eastAsia="Consolas"/>
-                <w:b w:val="0"/>
-                <w:i w:val="0"/>
-                <w:color w:val="222428"/>
-                <w:sz w:val="14"/>
-              </w:rPr>
-              <w:t>VALUES (50, 'Test User', '9000000050', DATE '2035-01-01', DATE '1995-01-01');</w:t>
+              <w:t>BEGIN</w:t>
+              <w:br/>
+            </w:r>
+            <w:r>
+              <w:rPr>
+                <w:rFonts w:ascii="Consolas" w:hAnsi="Consolas" w:eastAsia="Consolas"/>
+                <w:b w:val="0"/>
+                <w:i w:val="0"/>
+                <w:color w:val="222428"/>
+                <w:sz w:val="14"/>
+              </w:rPr>
+              <w:t xml:space="preserve">  INSERT INTO customer (customer_id, name, phone, license_expiry, dob)</w:t>
+              <w:br/>
+            </w:r>
+            <w:r>
+              <w:rPr>
+                <w:rFonts w:ascii="Consolas" w:hAnsi="Consolas" w:eastAsia="Consolas"/>
+                <w:b w:val="0"/>
+                <w:i w:val="0"/>
+                <w:color w:val="222428"/>
+                <w:sz w:val="14"/>
+              </w:rPr>
+              <w:t xml:space="preserve">  VALUES (50, 'Test User', '9000000050', DATE '2035-01-01', DATE '1995-01-01');</w:t>
+              <w:br/>
+            </w:r>
+            <w:r>
+              <w:rPr>
+                <w:rFonts w:ascii="Consolas" w:hAnsi="Consolas" w:eastAsia="Consolas"/>
+                <w:b w:val="0"/>
+                <w:i w:val="0"/>
+                <w:color w:val="222428"/>
+                <w:sz w:val="14"/>
+              </w:rPr>
+              <w:t xml:space="preserve">  DBMS_OUTPUT.PUT_LINE('Accepted - constraint NOT working');</w:t>
+              <w:br/>
+            </w:r>
+            <w:r>
+              <w:rPr>
+                <w:rFonts w:ascii="Consolas" w:hAnsi="Consolas" w:eastAsia="Consolas"/>
+                <w:b w:val="0"/>
+                <w:i w:val="0"/>
+                <w:color w:val="222428"/>
+                <w:sz w:val="14"/>
+              </w:rPr>
+              <w:t>EXCEPTION WHEN OTHERS THEN DBMS_OUTPUT.PUT_LINE('Rejected: ' || REGEXP_SUBSTR(SQLERRM, '[^' || CHR(10) || ']+'));</w:t>
+              <w:br/>
+            </w:r>
+            <w:r>
+              <w:rPr>
+                <w:rFonts w:ascii="Consolas" w:hAnsi="Consolas" w:eastAsia="Consolas"/>
+                <w:b w:val="0"/>
+                <w:i w:val="0"/>
+                <w:color w:val="222428"/>
+                <w:sz w:val="14"/>
+              </w:rPr>
+              <w:t>END;</w:t>
+              <w:br/>
+            </w:r>
+            <w:r>
+              <w:rPr>
+                <w:rFonts w:ascii="Consolas" w:hAnsi="Consolas" w:eastAsia="Consolas"/>
+                <w:b w:val="0"/>
+                <w:i w:val="0"/>
+                <w:color w:val="222428"/>
+                <w:sz w:val="14"/>
+              </w:rPr>
+              <w:t>/</w:t>
             </w:r>
           </w:p>
         </w:tc>
@@ -1841,7 +2061,62 @@
                 <w:color w:val="222428"/>
                 <w:sz w:val="14"/>
               </w:rPr>
-              <w:t>INSERT INTO payment VALUES (500, 999, 1000, SYSDATE, 'CASH', 'ADVANCE', 'SUCCESS');</w:t>
+              <w:t>BEGIN</w:t>
+              <w:br/>
+            </w:r>
+            <w:r>
+              <w:rPr>
+                <w:rFonts w:ascii="Consolas" w:hAnsi="Consolas" w:eastAsia="Consolas"/>
+                <w:b w:val="0"/>
+                <w:i w:val="0"/>
+                <w:color w:val="222428"/>
+                <w:sz w:val="14"/>
+              </w:rPr>
+              <w:t xml:space="preserve">  INSERT INTO payment VALUES (500, 999, 1000, SYSDATE, 'CASH', 'ADVANCE', 'SUCCESS');</w:t>
+              <w:br/>
+            </w:r>
+            <w:r>
+              <w:rPr>
+                <w:rFonts w:ascii="Consolas" w:hAnsi="Consolas" w:eastAsia="Consolas"/>
+                <w:b w:val="0"/>
+                <w:i w:val="0"/>
+                <w:color w:val="222428"/>
+                <w:sz w:val="14"/>
+              </w:rPr>
+              <w:t xml:space="preserve">  DBMS_OUTPUT.PUT_LINE('Accepted - constraint NOT working');</w:t>
+              <w:br/>
+            </w:r>
+            <w:r>
+              <w:rPr>
+                <w:rFonts w:ascii="Consolas" w:hAnsi="Consolas" w:eastAsia="Consolas"/>
+                <w:b w:val="0"/>
+                <w:i w:val="0"/>
+                <w:color w:val="222428"/>
+                <w:sz w:val="14"/>
+              </w:rPr>
+              <w:t>EXCEPTION WHEN OTHERS THEN DBMS_OUTPUT.PUT_LINE('Rejected: ' || REGEXP_SUBSTR(SQLERRM, '[^' || CHR(10) || ']+'));</w:t>
+              <w:br/>
+            </w:r>
+            <w:r>
+              <w:rPr>
+                <w:rFonts w:ascii="Consolas" w:hAnsi="Consolas" w:eastAsia="Consolas"/>
+                <w:b w:val="0"/>
+                <w:i w:val="0"/>
+                <w:color w:val="222428"/>
+                <w:sz w:val="14"/>
+              </w:rPr>
+              <w:t>END;</w:t>
+              <w:br/>
+            </w:r>
+            <w:r>
+              <w:rPr>
+                <w:rFonts w:ascii="Consolas" w:hAnsi="Consolas" w:eastAsia="Consolas"/>
+                <w:b w:val="0"/>
+                <w:i w:val="0"/>
+                <w:color w:val="222428"/>
+                <w:sz w:val="14"/>
+              </w:rPr>
+              <w:t>/</w:t>
               <w:br/>
             </w:r>
             <w:r>
@@ -1863,7 +2138,62 @@
                 <w:color w:val="222428"/>
                 <w:sz w:val="14"/>
               </w:rPr>
-              <w:t>DELETE FROM customer WHERE customer_id = 1;</w:t>
+              <w:t>BEGIN</w:t>
+              <w:br/>
+            </w:r>
+            <w:r>
+              <w:rPr>
+                <w:rFonts w:ascii="Consolas" w:hAnsi="Consolas" w:eastAsia="Consolas"/>
+                <w:b w:val="0"/>
+                <w:i w:val="0"/>
+                <w:color w:val="222428"/>
+                <w:sz w:val="14"/>
+              </w:rPr>
+              <w:t xml:space="preserve">  DELETE FROM customer WHERE customer_id = 1;</w:t>
+              <w:br/>
+            </w:r>
+            <w:r>
+              <w:rPr>
+                <w:rFonts w:ascii="Consolas" w:hAnsi="Consolas" w:eastAsia="Consolas"/>
+                <w:b w:val="0"/>
+                <w:i w:val="0"/>
+                <w:color w:val="222428"/>
+                <w:sz w:val="14"/>
+              </w:rPr>
+              <w:t xml:space="preserve">  DBMS_OUTPUT.PUT_LINE('Accepted - constraint NOT working');</w:t>
+              <w:br/>
+            </w:r>
+            <w:r>
+              <w:rPr>
+                <w:rFonts w:ascii="Consolas" w:hAnsi="Consolas" w:eastAsia="Consolas"/>
+                <w:b w:val="0"/>
+                <w:i w:val="0"/>
+                <w:color w:val="222428"/>
+                <w:sz w:val="14"/>
+              </w:rPr>
+              <w:t>EXCEPTION WHEN OTHERS THEN DBMS_OUTPUT.PUT_LINE('Rejected: ' || REGEXP_SUBSTR(SQLERRM, '[^' || CHR(10) || ']+'));</w:t>
+              <w:br/>
+            </w:r>
+            <w:r>
+              <w:rPr>
+                <w:rFonts w:ascii="Consolas" w:hAnsi="Consolas" w:eastAsia="Consolas"/>
+                <w:b w:val="0"/>
+                <w:i w:val="0"/>
+                <w:color w:val="222428"/>
+                <w:sz w:val="14"/>
+              </w:rPr>
+              <w:t>END;</w:t>
+              <w:br/>
+            </w:r>
+            <w:r>
+              <w:rPr>
+                <w:rFonts w:ascii="Consolas" w:hAnsi="Consolas" w:eastAsia="Consolas"/>
+                <w:b w:val="0"/>
+                <w:i w:val="0"/>
+                <w:color w:val="222428"/>
+                <w:sz w:val="14"/>
+              </w:rPr>
+              <w:t>/</w:t>
               <w:br/>
             </w:r>
             <w:r>
@@ -1885,7 +2215,62 @@
                 <w:color w:val="222428"/>
                 <w:sz w:val="14"/>
               </w:rPr>
-              <w:t>UPDATE booking SET end_date = start_date - 1 WHERE booking_id = 1;</w:t>
+              <w:t>BEGIN</w:t>
+              <w:br/>
+            </w:r>
+            <w:r>
+              <w:rPr>
+                <w:rFonts w:ascii="Consolas" w:hAnsi="Consolas" w:eastAsia="Consolas"/>
+                <w:b w:val="0"/>
+                <w:i w:val="0"/>
+                <w:color w:val="222428"/>
+                <w:sz w:val="14"/>
+              </w:rPr>
+              <w:t xml:space="preserve">  UPDATE booking SET end_date = start_date - 1 WHERE booking_id = 1;</w:t>
+              <w:br/>
+            </w:r>
+            <w:r>
+              <w:rPr>
+                <w:rFonts w:ascii="Consolas" w:hAnsi="Consolas" w:eastAsia="Consolas"/>
+                <w:b w:val="0"/>
+                <w:i w:val="0"/>
+                <w:color w:val="222428"/>
+                <w:sz w:val="14"/>
+              </w:rPr>
+              <w:t xml:space="preserve">  DBMS_OUTPUT.PUT_LINE('Accepted - constraint NOT working');</w:t>
+              <w:br/>
+            </w:r>
+            <w:r>
+              <w:rPr>
+                <w:rFonts w:ascii="Consolas" w:hAnsi="Consolas" w:eastAsia="Consolas"/>
+                <w:b w:val="0"/>
+                <w:i w:val="0"/>
+                <w:color w:val="222428"/>
+                <w:sz w:val="14"/>
+              </w:rPr>
+              <w:t>EXCEPTION WHEN OTHERS THEN DBMS_OUTPUT.PUT_LINE('Rejected: ' || REGEXP_SUBSTR(SQLERRM, '[^' || CHR(10) || ']+'));</w:t>
+              <w:br/>
+            </w:r>
+            <w:r>
+              <w:rPr>
+                <w:rFonts w:ascii="Consolas" w:hAnsi="Consolas" w:eastAsia="Consolas"/>
+                <w:b w:val="0"/>
+                <w:i w:val="0"/>
+                <w:color w:val="222428"/>
+                <w:sz w:val="14"/>
+              </w:rPr>
+              <w:t>END;</w:t>
+              <w:br/>
+            </w:r>
+            <w:r>
+              <w:rPr>
+                <w:rFonts w:ascii="Consolas" w:hAnsi="Consolas" w:eastAsia="Consolas"/>
+                <w:b w:val="0"/>
+                <w:i w:val="0"/>
+                <w:color w:val="222428"/>
+                <w:sz w:val="14"/>
+              </w:rPr>
+              <w:t>/</w:t>
               <w:br/>
             </w:r>
             <w:r>
@@ -1907,7 +2292,62 @@
                 <w:color w:val="222428"/>
                 <w:sz w:val="14"/>
               </w:rPr>
-              <w:t>UPDATE booking SET end_odometer = 100 WHERE booking_id = 1;</w:t>
+              <w:t>BEGIN</w:t>
+              <w:br/>
+            </w:r>
+            <w:r>
+              <w:rPr>
+                <w:rFonts w:ascii="Consolas" w:hAnsi="Consolas" w:eastAsia="Consolas"/>
+                <w:b w:val="0"/>
+                <w:i w:val="0"/>
+                <w:color w:val="222428"/>
+                <w:sz w:val="14"/>
+              </w:rPr>
+              <w:t xml:space="preserve">  UPDATE booking SET end_odometer = 100 WHERE booking_id = 1;</w:t>
+              <w:br/>
+            </w:r>
+            <w:r>
+              <w:rPr>
+                <w:rFonts w:ascii="Consolas" w:hAnsi="Consolas" w:eastAsia="Consolas"/>
+                <w:b w:val="0"/>
+                <w:i w:val="0"/>
+                <w:color w:val="222428"/>
+                <w:sz w:val="14"/>
+              </w:rPr>
+              <w:t xml:space="preserve">  DBMS_OUTPUT.PUT_LINE('Accepted - constraint NOT working');</w:t>
+              <w:br/>
+            </w:r>
+            <w:r>
+              <w:rPr>
+                <w:rFonts w:ascii="Consolas" w:hAnsi="Consolas" w:eastAsia="Consolas"/>
+                <w:b w:val="0"/>
+                <w:i w:val="0"/>
+                <w:color w:val="222428"/>
+                <w:sz w:val="14"/>
+              </w:rPr>
+              <w:t>EXCEPTION WHEN OTHERS THEN DBMS_OUTPUT.PUT_LINE('Rejected: ' || REGEXP_SUBSTR(SQLERRM, '[^' || CHR(10) || ']+'));</w:t>
+              <w:br/>
+            </w:r>
+            <w:r>
+              <w:rPr>
+                <w:rFonts w:ascii="Consolas" w:hAnsi="Consolas" w:eastAsia="Consolas"/>
+                <w:b w:val="0"/>
+                <w:i w:val="0"/>
+                <w:color w:val="222428"/>
+                <w:sz w:val="14"/>
+              </w:rPr>
+              <w:t>END;</w:t>
+              <w:br/>
+            </w:r>
+            <w:r>
+              <w:rPr>
+                <w:rFonts w:ascii="Consolas" w:hAnsi="Consolas" w:eastAsia="Consolas"/>
+                <w:b w:val="0"/>
+                <w:i w:val="0"/>
+                <w:color w:val="222428"/>
+                <w:sz w:val="14"/>
+              </w:rPr>
+              <w:t>/</w:t>
               <w:br/>
             </w:r>
             <w:r>
@@ -7569,18 +8009,128 @@
                 <w:color w:val="222428"/>
                 <w:sz w:val="14"/>
               </w:rPr>
-              <w:t>EXEC sp_register_customer('Arav Shah', '9000000001', NULL, 'TN0920250000001', DATE '2035-01-01', DATE '2010-01-01');</w:t>
-              <w:br/>
-            </w:r>
-            <w:r>
-              <w:rPr>
-                <w:rFonts w:ascii="Consolas" w:hAnsi="Consolas" w:eastAsia="Consolas"/>
-                <w:b w:val="0"/>
-                <w:i w:val="0"/>
-                <w:color w:val="222428"/>
-                <w:sz w:val="14"/>
-              </w:rPr>
-              <w:t>EXEC sp_register_customer('Nikhil Das', '9000000002', NULL, 'TN0920000000002', DATE '2025-01-01', DATE '1990-01-01');</w:t>
+              <w:t>BEGIN</w:t>
+              <w:br/>
+            </w:r>
+            <w:r>
+              <w:rPr>
+                <w:rFonts w:ascii="Consolas" w:hAnsi="Consolas" w:eastAsia="Consolas"/>
+                <w:b w:val="0"/>
+                <w:i w:val="0"/>
+                <w:color w:val="222428"/>
+                <w:sz w:val="14"/>
+              </w:rPr>
+              <w:t xml:space="preserve">  sp_register_customer('Arav Shah', '9000000001', NULL, 'TN0920250000001', DATE '2035-01-01', DATE '2010-01-01');</w:t>
+              <w:br/>
+            </w:r>
+            <w:r>
+              <w:rPr>
+                <w:rFonts w:ascii="Consolas" w:hAnsi="Consolas" w:eastAsia="Consolas"/>
+                <w:b w:val="0"/>
+                <w:i w:val="0"/>
+                <w:color w:val="222428"/>
+                <w:sz w:val="14"/>
+              </w:rPr>
+              <w:t xml:space="preserve">  DBMS_OUTPUT.PUT_LINE('Accepted - rule NOT working');</w:t>
+              <w:br/>
+            </w:r>
+            <w:r>
+              <w:rPr>
+                <w:rFonts w:ascii="Consolas" w:hAnsi="Consolas" w:eastAsia="Consolas"/>
+                <w:b w:val="0"/>
+                <w:i w:val="0"/>
+                <w:color w:val="222428"/>
+                <w:sz w:val="14"/>
+              </w:rPr>
+              <w:t>EXCEPTION WHEN OTHERS THEN DBMS_OUTPUT.PUT_LINE('Rejected: ' || REGEXP_SUBSTR(SQLERRM, '[^' || CHR(10) || ']+'));</w:t>
+              <w:br/>
+            </w:r>
+            <w:r>
+              <w:rPr>
+                <w:rFonts w:ascii="Consolas" w:hAnsi="Consolas" w:eastAsia="Consolas"/>
+                <w:b w:val="0"/>
+                <w:i w:val="0"/>
+                <w:color w:val="222428"/>
+                <w:sz w:val="14"/>
+              </w:rPr>
+              <w:t>END;</w:t>
+              <w:br/>
+            </w:r>
+            <w:r>
+              <w:rPr>
+                <w:rFonts w:ascii="Consolas" w:hAnsi="Consolas" w:eastAsia="Consolas"/>
+                <w:b w:val="0"/>
+                <w:i w:val="0"/>
+                <w:color w:val="222428"/>
+                <w:sz w:val="14"/>
+              </w:rPr>
+              <w:t>/</w:t>
+              <w:br/>
+            </w:r>
+            <w:r>
+              <w:rPr>
+                <w:rFonts w:ascii="Consolas" w:hAnsi="Consolas" w:eastAsia="Consolas"/>
+                <w:b w:val="0"/>
+                <w:i w:val="0"/>
+                <w:color w:val="222428"/>
+                <w:sz w:val="14"/>
+              </w:rPr>
+              <w:t>BEGIN</w:t>
+              <w:br/>
+            </w:r>
+            <w:r>
+              <w:rPr>
+                <w:rFonts w:ascii="Consolas" w:hAnsi="Consolas" w:eastAsia="Consolas"/>
+                <w:b w:val="0"/>
+                <w:i w:val="0"/>
+                <w:color w:val="222428"/>
+                <w:sz w:val="14"/>
+              </w:rPr>
+              <w:t xml:space="preserve">  sp_register_customer('Nikhil Das', '9000000002', NULL, 'TN0920000000002', DATE '2025-01-01', DATE '1990-01-01');</w:t>
+              <w:br/>
+            </w:r>
+            <w:r>
+              <w:rPr>
+                <w:rFonts w:ascii="Consolas" w:hAnsi="Consolas" w:eastAsia="Consolas"/>
+                <w:b w:val="0"/>
+                <w:i w:val="0"/>
+                <w:color w:val="222428"/>
+                <w:sz w:val="14"/>
+              </w:rPr>
+              <w:t xml:space="preserve">  DBMS_OUTPUT.PUT_LINE('Accepted - rule NOT working');</w:t>
+              <w:br/>
+            </w:r>
+            <w:r>
+              <w:rPr>
+                <w:rFonts w:ascii="Consolas" w:hAnsi="Consolas" w:eastAsia="Consolas"/>
+                <w:b w:val="0"/>
+                <w:i w:val="0"/>
+                <w:color w:val="222428"/>
+                <w:sz w:val="14"/>
+              </w:rPr>
+              <w:t>EXCEPTION WHEN OTHERS THEN DBMS_OUTPUT.PUT_LINE('Rejected: ' || REGEXP_SUBSTR(SQLERRM, '[^' || CHR(10) || ']+'));</w:t>
+              <w:br/>
+            </w:r>
+            <w:r>
+              <w:rPr>
+                <w:rFonts w:ascii="Consolas" w:hAnsi="Consolas" w:eastAsia="Consolas"/>
+                <w:b w:val="0"/>
+                <w:i w:val="0"/>
+                <w:color w:val="222428"/>
+                <w:sz w:val="14"/>
+              </w:rPr>
+              <w:t>END;</w:t>
+              <w:br/>
+            </w:r>
+            <w:r>
+              <w:rPr>
+                <w:rFonts w:ascii="Consolas" w:hAnsi="Consolas" w:eastAsia="Consolas"/>
+                <w:b w:val="0"/>
+                <w:i w:val="0"/>
+                <w:color w:val="222428"/>
+                <w:sz w:val="14"/>
+              </w:rPr>
+              <w:t>/</w:t>
             </w:r>
           </w:p>
         </w:tc>
@@ -7711,7 +8261,73 @@
                 <w:color w:val="222428"/>
                 <w:sz w:val="14"/>
               </w:rPr>
-              <w:t>EXEC sp_create_booking(4, 1, 2, 1, 1, TO_DATE('2027-05-01 10:00', 'YYYY-MM-DD HH24:MI'), TO_DATE('2027-05-03 10:00', 'YYYY-MM-DD HH24:MI'), 1000, 'UPI');</w:t>
+              <w:t>BEGIN</w:t>
+              <w:br/>
+            </w:r>
+            <w:r>
+              <w:rPr>
+                <w:rFonts w:ascii="Consolas" w:hAnsi="Consolas" w:eastAsia="Consolas"/>
+                <w:b w:val="0"/>
+                <w:i w:val="0"/>
+                <w:color w:val="222428"/>
+                <w:sz w:val="14"/>
+              </w:rPr>
+              <w:t xml:space="preserve">  sp_create_booking(4, 1, 2, 1, 1,</w:t>
+              <w:br/>
+            </w:r>
+            <w:r>
+              <w:rPr>
+                <w:rFonts w:ascii="Consolas" w:hAnsi="Consolas" w:eastAsia="Consolas"/>
+                <w:b w:val="0"/>
+                <w:i w:val="0"/>
+                <w:color w:val="222428"/>
+                <w:sz w:val="14"/>
+              </w:rPr>
+              <w:t xml:space="preserve">                    TO_DATE('2027-05-01 10:00', 'YYYY-MM-DD HH24:MI'), TO_DATE('2027-05-03 10:00', 'YYYY-MM-DD HH24:MI'), 1000, 'UPI');</w:t>
+              <w:br/>
+            </w:r>
+            <w:r>
+              <w:rPr>
+                <w:rFonts w:ascii="Consolas" w:hAnsi="Consolas" w:eastAsia="Consolas"/>
+                <w:b w:val="0"/>
+                <w:i w:val="0"/>
+                <w:color w:val="222428"/>
+                <w:sz w:val="14"/>
+              </w:rPr>
+              <w:t xml:space="preserve">  DBMS_OUTPUT.PUT_LINE('Accepted - rule NOT working');</w:t>
+              <w:br/>
+            </w:r>
+            <w:r>
+              <w:rPr>
+                <w:rFonts w:ascii="Consolas" w:hAnsi="Consolas" w:eastAsia="Consolas"/>
+                <w:b w:val="0"/>
+                <w:i w:val="0"/>
+                <w:color w:val="222428"/>
+                <w:sz w:val="14"/>
+              </w:rPr>
+              <w:t>EXCEPTION WHEN OTHERS THEN DBMS_OUTPUT.PUT_LINE('Rejected: ' || REGEXP_SUBSTR(SQLERRM, '[^' || CHR(10) || ']+'));</w:t>
+              <w:br/>
+            </w:r>
+            <w:r>
+              <w:rPr>
+                <w:rFonts w:ascii="Consolas" w:hAnsi="Consolas" w:eastAsia="Consolas"/>
+                <w:b w:val="0"/>
+                <w:i w:val="0"/>
+                <w:color w:val="222428"/>
+                <w:sz w:val="14"/>
+              </w:rPr>
+              <w:t>END;</w:t>
+              <w:br/>
+            </w:r>
+            <w:r>
+              <w:rPr>
+                <w:rFonts w:ascii="Consolas" w:hAnsi="Consolas" w:eastAsia="Consolas"/>
+                <w:b w:val="0"/>
+                <w:i w:val="0"/>
+                <w:color w:val="222428"/>
+                <w:sz w:val="14"/>
+              </w:rPr>
+              <w:t>/</w:t>
               <w:br/>
             </w:r>
             <w:r>
@@ -7733,7 +8349,62 @@
                 <w:color w:val="222428"/>
                 <w:sz w:val="14"/>
               </w:rPr>
-              <w:t>EXEC sp_create_booking(1, 5, 6, 4, 4, TRUNC(SYSDATE) + 20 + 9/24, TRUNC(SYSDATE) + 22 + 9/24, 0);</w:t>
+              <w:t>BEGIN</w:t>
+              <w:br/>
+            </w:r>
+            <w:r>
+              <w:rPr>
+                <w:rFonts w:ascii="Consolas" w:hAnsi="Consolas" w:eastAsia="Consolas"/>
+                <w:b w:val="0"/>
+                <w:i w:val="0"/>
+                <w:color w:val="222428"/>
+                <w:sz w:val="14"/>
+              </w:rPr>
+              <w:t xml:space="preserve">  sp_create_booking(1, 5, 6, 4, 4, TRUNC(SYSDATE) + 20 + 9/24, TRUNC(SYSDATE) + 22 + 9/24, 0);</w:t>
+              <w:br/>
+            </w:r>
+            <w:r>
+              <w:rPr>
+                <w:rFonts w:ascii="Consolas" w:hAnsi="Consolas" w:eastAsia="Consolas"/>
+                <w:b w:val="0"/>
+                <w:i w:val="0"/>
+                <w:color w:val="222428"/>
+                <w:sz w:val="14"/>
+              </w:rPr>
+              <w:t xml:space="preserve">  DBMS_OUTPUT.PUT_LINE('Accepted - rule NOT working');</w:t>
+              <w:br/>
+            </w:r>
+            <w:r>
+              <w:rPr>
+                <w:rFonts w:ascii="Consolas" w:hAnsi="Consolas" w:eastAsia="Consolas"/>
+                <w:b w:val="0"/>
+                <w:i w:val="0"/>
+                <w:color w:val="222428"/>
+                <w:sz w:val="14"/>
+              </w:rPr>
+              <w:t>EXCEPTION WHEN OTHERS THEN DBMS_OUTPUT.PUT_LINE('Rejected: ' || REGEXP_SUBSTR(SQLERRM, '[^' || CHR(10) || ']+'));</w:t>
+              <w:br/>
+            </w:r>
+            <w:r>
+              <w:rPr>
+                <w:rFonts w:ascii="Consolas" w:hAnsi="Consolas" w:eastAsia="Consolas"/>
+                <w:b w:val="0"/>
+                <w:i w:val="0"/>
+                <w:color w:val="222428"/>
+                <w:sz w:val="14"/>
+              </w:rPr>
+              <w:t>END;</w:t>
+              <w:br/>
+            </w:r>
+            <w:r>
+              <w:rPr>
+                <w:rFonts w:ascii="Consolas" w:hAnsi="Consolas" w:eastAsia="Consolas"/>
+                <w:b w:val="0"/>
+                <w:i w:val="0"/>
+                <w:color w:val="222428"/>
+                <w:sz w:val="14"/>
+              </w:rPr>
+              <w:t>/</w:t>
             </w:r>
           </w:p>
         </w:tc>
@@ -7941,7 +8612,62 @@
                 <w:color w:val="222428"/>
                 <w:sz w:val="14"/>
               </w:rPr>
-              <w:t>EXEC sp_create_booking(13, 3, 3, 2, 2, TRUNC(SYSDATE) + 5 + 10/24, TRUNC(SYSDATE) + 6 + 10/24, 0);</w:t>
+              <w:t>BEGIN</w:t>
+              <w:br/>
+            </w:r>
+            <w:r>
+              <w:rPr>
+                <w:rFonts w:ascii="Consolas" w:hAnsi="Consolas" w:eastAsia="Consolas"/>
+                <w:b w:val="0"/>
+                <w:i w:val="0"/>
+                <w:color w:val="222428"/>
+                <w:sz w:val="14"/>
+              </w:rPr>
+              <w:t xml:space="preserve">  sp_create_booking(13, 3, 3, 2, 2, TRUNC(SYSDATE) + 5 + 10/24, TRUNC(SYSDATE) + 6 + 10/24, 0);</w:t>
+              <w:br/>
+            </w:r>
+            <w:r>
+              <w:rPr>
+                <w:rFonts w:ascii="Consolas" w:hAnsi="Consolas" w:eastAsia="Consolas"/>
+                <w:b w:val="0"/>
+                <w:i w:val="0"/>
+                <w:color w:val="222428"/>
+                <w:sz w:val="14"/>
+              </w:rPr>
+              <w:t xml:space="preserve">  DBMS_OUTPUT.PUT_LINE('Accepted - rule NOT working');</w:t>
+              <w:br/>
+            </w:r>
+            <w:r>
+              <w:rPr>
+                <w:rFonts w:ascii="Consolas" w:hAnsi="Consolas" w:eastAsia="Consolas"/>
+                <w:b w:val="0"/>
+                <w:i w:val="0"/>
+                <w:color w:val="222428"/>
+                <w:sz w:val="14"/>
+              </w:rPr>
+              <w:t>EXCEPTION WHEN OTHERS THEN DBMS_OUTPUT.PUT_LINE('Rejected: ' || REGEXP_SUBSTR(SQLERRM, '[^' || CHR(10) || ']+'));</w:t>
+              <w:br/>
+            </w:r>
+            <w:r>
+              <w:rPr>
+                <w:rFonts w:ascii="Consolas" w:hAnsi="Consolas" w:eastAsia="Consolas"/>
+                <w:b w:val="0"/>
+                <w:i w:val="0"/>
+                <w:color w:val="222428"/>
+                <w:sz w:val="14"/>
+              </w:rPr>
+              <w:t>END;</w:t>
+              <w:br/>
+            </w:r>
+            <w:r>
+              <w:rPr>
+                <w:rFonts w:ascii="Consolas" w:hAnsi="Consolas" w:eastAsia="Consolas"/>
+                <w:b w:val="0"/>
+                <w:i w:val="0"/>
+                <w:color w:val="222428"/>
+                <w:sz w:val="14"/>
+              </w:rPr>
+              <w:t>/</w:t>
               <w:br/>
             </w:r>
             <w:r>
@@ -7963,18 +8689,73 @@
                 <w:color w:val="222428"/>
                 <w:sz w:val="14"/>
               </w:rPr>
-              <w:t>INSERT INTO maintenance (maint_id, vehicle_id, service_type, description, maint_status)</w:t>
-              <w:br/>
-            </w:r>
-            <w:r>
-              <w:rPr>
-                <w:rFonts w:ascii="Consolas" w:hAnsi="Consolas" w:eastAsia="Consolas"/>
-                <w:b w:val="0"/>
-                <w:i w:val="0"/>
-                <w:color w:val="222428"/>
-                <w:sz w:val="14"/>
-              </w:rPr>
-              <w:t>VALUES (seq_maintenance.NEXTVAL, 2, 'GENERAL', 'Periodic service', 'IN_PROGRESS');</w:t>
+              <w:t>BEGIN</w:t>
+              <w:br/>
+            </w:r>
+            <w:r>
+              <w:rPr>
+                <w:rFonts w:ascii="Consolas" w:hAnsi="Consolas" w:eastAsia="Consolas"/>
+                <w:b w:val="0"/>
+                <w:i w:val="0"/>
+                <w:color w:val="222428"/>
+                <w:sz w:val="14"/>
+              </w:rPr>
+              <w:t xml:space="preserve">  INSERT INTO maintenance (maint_id, vehicle_id, service_type, description, maint_status)</w:t>
+              <w:br/>
+            </w:r>
+            <w:r>
+              <w:rPr>
+                <w:rFonts w:ascii="Consolas" w:hAnsi="Consolas" w:eastAsia="Consolas"/>
+                <w:b w:val="0"/>
+                <w:i w:val="0"/>
+                <w:color w:val="222428"/>
+                <w:sz w:val="14"/>
+              </w:rPr>
+              <w:t xml:space="preserve">  VALUES (seq_maintenance.NEXTVAL, 2, 'GENERAL', 'Periodic service', 'IN_PROGRESS');</w:t>
+              <w:br/>
+            </w:r>
+            <w:r>
+              <w:rPr>
+                <w:rFonts w:ascii="Consolas" w:hAnsi="Consolas" w:eastAsia="Consolas"/>
+                <w:b w:val="0"/>
+                <w:i w:val="0"/>
+                <w:color w:val="222428"/>
+                <w:sz w:val="14"/>
+              </w:rPr>
+              <w:t xml:space="preserve">  DBMS_OUTPUT.PUT_LINE('Accepted - rule NOT working');</w:t>
+              <w:br/>
+            </w:r>
+            <w:r>
+              <w:rPr>
+                <w:rFonts w:ascii="Consolas" w:hAnsi="Consolas" w:eastAsia="Consolas"/>
+                <w:b w:val="0"/>
+                <w:i w:val="0"/>
+                <w:color w:val="222428"/>
+                <w:sz w:val="14"/>
+              </w:rPr>
+              <w:t>EXCEPTION WHEN OTHERS THEN DBMS_OUTPUT.PUT_LINE('Rejected: ' || REGEXP_SUBSTR(SQLERRM, '[^' || CHR(10) || ']+'));</w:t>
+              <w:br/>
+            </w:r>
+            <w:r>
+              <w:rPr>
+                <w:rFonts w:ascii="Consolas" w:hAnsi="Consolas" w:eastAsia="Consolas"/>
+                <w:b w:val="0"/>
+                <w:i w:val="0"/>
+                <w:color w:val="222428"/>
+                <w:sz w:val="14"/>
+              </w:rPr>
+              <w:t>END;</w:t>
+              <w:br/>
+            </w:r>
+            <w:r>
+              <w:rPr>
+                <w:rFonts w:ascii="Consolas" w:hAnsi="Consolas" w:eastAsia="Consolas"/>
+                <w:b w:val="0"/>
+                <w:i w:val="0"/>
+                <w:color w:val="222428"/>
+                <w:sz w:val="14"/>
+              </w:rPr>
+              <w:t>/</w:t>
             </w:r>
           </w:p>
         </w:tc>
@@ -8105,7 +8886,73 @@
                 <w:color w:val="222428"/>
                 <w:sz w:val="14"/>
               </w:rPr>
-              <w:t>EXEC sp_create_booking(10, 1, 2, 1, 1, TO_DATE('2026-10-21 10:00', 'YYYY-MM-DD HH24:MI'), TO_DATE('2026-10-23 10:00', 'YYYY-MM-DD HH24:MI'), 500, 'UPI');</w:t>
+              <w:t>BEGIN</w:t>
+              <w:br/>
+            </w:r>
+            <w:r>
+              <w:rPr>
+                <w:rFonts w:ascii="Consolas" w:hAnsi="Consolas" w:eastAsia="Consolas"/>
+                <w:b w:val="0"/>
+                <w:i w:val="0"/>
+                <w:color w:val="222428"/>
+                <w:sz w:val="14"/>
+              </w:rPr>
+              <w:t xml:space="preserve">  sp_create_booking(10, 1, 2, 1, 1,</w:t>
+              <w:br/>
+            </w:r>
+            <w:r>
+              <w:rPr>
+                <w:rFonts w:ascii="Consolas" w:hAnsi="Consolas" w:eastAsia="Consolas"/>
+                <w:b w:val="0"/>
+                <w:i w:val="0"/>
+                <w:color w:val="222428"/>
+                <w:sz w:val="14"/>
+              </w:rPr>
+              <w:t xml:space="preserve">                    TO_DATE('2026-10-21 10:00', 'YYYY-MM-DD HH24:MI'), TO_DATE('2026-10-23 10:00', 'YYYY-MM-DD HH24:MI'), 500, 'UPI');</w:t>
+              <w:br/>
+            </w:r>
+            <w:r>
+              <w:rPr>
+                <w:rFonts w:ascii="Consolas" w:hAnsi="Consolas" w:eastAsia="Consolas"/>
+                <w:b w:val="0"/>
+                <w:i w:val="0"/>
+                <w:color w:val="222428"/>
+                <w:sz w:val="14"/>
+              </w:rPr>
+              <w:t xml:space="preserve">  DBMS_OUTPUT.PUT_LINE('Accepted - rule NOT working');</w:t>
+              <w:br/>
+            </w:r>
+            <w:r>
+              <w:rPr>
+                <w:rFonts w:ascii="Consolas" w:hAnsi="Consolas" w:eastAsia="Consolas"/>
+                <w:b w:val="0"/>
+                <w:i w:val="0"/>
+                <w:color w:val="222428"/>
+                <w:sz w:val="14"/>
+              </w:rPr>
+              <w:t>EXCEPTION WHEN OTHERS THEN DBMS_OUTPUT.PUT_LINE('Rejected: ' || REGEXP_SUBSTR(SQLERRM, '[^' || CHR(10) || ']+'));</w:t>
+              <w:br/>
+            </w:r>
+            <w:r>
+              <w:rPr>
+                <w:rFonts w:ascii="Consolas" w:hAnsi="Consolas" w:eastAsia="Consolas"/>
+                <w:b w:val="0"/>
+                <w:i w:val="0"/>
+                <w:color w:val="222428"/>
+                <w:sz w:val="14"/>
+              </w:rPr>
+              <w:t>END;</w:t>
+              <w:br/>
+            </w:r>
+            <w:r>
+              <w:rPr>
+                <w:rFonts w:ascii="Consolas" w:hAnsi="Consolas" w:eastAsia="Consolas"/>
+                <w:b w:val="0"/>
+                <w:i w:val="0"/>
+                <w:color w:val="222428"/>
+                <w:sz w:val="14"/>
+              </w:rPr>
+              <w:t>/</w:t>
               <w:br/>
             </w:r>
             <w:r>
@@ -8127,7 +8974,73 @@
                 <w:color w:val="222428"/>
                 <w:sz w:val="14"/>
               </w:rPr>
-              <w:t>EXEC sp_create_booking(10, 10, 2, 1, 1, TO_DATE('2026-11-02 10:00', 'YYYY-MM-DD HH24:MI'), TO_DATE('2026-11-03 10:00', 'YYYY-MM-DD HH24:MI'), 0);</w:t>
+              <w:t>BEGIN</w:t>
+              <w:br/>
+            </w:r>
+            <w:r>
+              <w:rPr>
+                <w:rFonts w:ascii="Consolas" w:hAnsi="Consolas" w:eastAsia="Consolas"/>
+                <w:b w:val="0"/>
+                <w:i w:val="0"/>
+                <w:color w:val="222428"/>
+                <w:sz w:val="14"/>
+              </w:rPr>
+              <w:t xml:space="preserve">  sp_create_booking(10, 10, 2, 1, 1,</w:t>
+              <w:br/>
+            </w:r>
+            <w:r>
+              <w:rPr>
+                <w:rFonts w:ascii="Consolas" w:hAnsi="Consolas" w:eastAsia="Consolas"/>
+                <w:b w:val="0"/>
+                <w:i w:val="0"/>
+                <w:color w:val="222428"/>
+                <w:sz w:val="14"/>
+              </w:rPr>
+              <w:t xml:space="preserve">                    TO_DATE('2026-11-02 10:00', 'YYYY-MM-DD HH24:MI'), TO_DATE('2026-11-03 10:00', 'YYYY-MM-DD HH24:MI'), 0);</w:t>
+              <w:br/>
+            </w:r>
+            <w:r>
+              <w:rPr>
+                <w:rFonts w:ascii="Consolas" w:hAnsi="Consolas" w:eastAsia="Consolas"/>
+                <w:b w:val="0"/>
+                <w:i w:val="0"/>
+                <w:color w:val="222428"/>
+                <w:sz w:val="14"/>
+              </w:rPr>
+              <w:t xml:space="preserve">  DBMS_OUTPUT.PUT_LINE('Accepted - rule NOT working');</w:t>
+              <w:br/>
+            </w:r>
+            <w:r>
+              <w:rPr>
+                <w:rFonts w:ascii="Consolas" w:hAnsi="Consolas" w:eastAsia="Consolas"/>
+                <w:b w:val="0"/>
+                <w:i w:val="0"/>
+                <w:color w:val="222428"/>
+                <w:sz w:val="14"/>
+              </w:rPr>
+              <w:t>EXCEPTION WHEN OTHERS THEN DBMS_OUTPUT.PUT_LINE('Rejected: ' || REGEXP_SUBSTR(SQLERRM, '[^' || CHR(10) || ']+'));</w:t>
+              <w:br/>
+            </w:r>
+            <w:r>
+              <w:rPr>
+                <w:rFonts w:ascii="Consolas" w:hAnsi="Consolas" w:eastAsia="Consolas"/>
+                <w:b w:val="0"/>
+                <w:i w:val="0"/>
+                <w:color w:val="222428"/>
+                <w:sz w:val="14"/>
+              </w:rPr>
+              <w:t>END;</w:t>
+              <w:br/>
+            </w:r>
+            <w:r>
+              <w:rPr>
+                <w:rFonts w:ascii="Consolas" w:hAnsi="Consolas" w:eastAsia="Consolas"/>
+                <w:b w:val="0"/>
+                <w:i w:val="0"/>
+                <w:color w:val="222428"/>
+                <w:sz w:val="14"/>
+              </w:rPr>
+              <w:t>/</w:t>
               <w:br/>
             </w:r>
             <w:r>
@@ -8149,7 +9062,62 @@
                 <w:color w:val="222428"/>
                 <w:sz w:val="14"/>
               </w:rPr>
-              <w:t>EXEC sp_pickup_vehicle(23);</w:t>
+              <w:t>BEGIN</w:t>
+              <w:br/>
+            </w:r>
+            <w:r>
+              <w:rPr>
+                <w:rFonts w:ascii="Consolas" w:hAnsi="Consolas" w:eastAsia="Consolas"/>
+                <w:b w:val="0"/>
+                <w:i w:val="0"/>
+                <w:color w:val="222428"/>
+                <w:sz w:val="14"/>
+              </w:rPr>
+              <w:t xml:space="preserve">  sp_pickup_vehicle(23);</w:t>
+              <w:br/>
+            </w:r>
+            <w:r>
+              <w:rPr>
+                <w:rFonts w:ascii="Consolas" w:hAnsi="Consolas" w:eastAsia="Consolas"/>
+                <w:b w:val="0"/>
+                <w:i w:val="0"/>
+                <w:color w:val="222428"/>
+                <w:sz w:val="14"/>
+              </w:rPr>
+              <w:t xml:space="preserve">  DBMS_OUTPUT.PUT_LINE('Accepted - rule NOT working');</w:t>
+              <w:br/>
+            </w:r>
+            <w:r>
+              <w:rPr>
+                <w:rFonts w:ascii="Consolas" w:hAnsi="Consolas" w:eastAsia="Consolas"/>
+                <w:b w:val="0"/>
+                <w:i w:val="0"/>
+                <w:color w:val="222428"/>
+                <w:sz w:val="14"/>
+              </w:rPr>
+              <w:t>EXCEPTION WHEN OTHERS THEN DBMS_OUTPUT.PUT_LINE('Rejected: ' || REGEXP_SUBSTR(SQLERRM, '[^' || CHR(10) || ']+'));</w:t>
+              <w:br/>
+            </w:r>
+            <w:r>
+              <w:rPr>
+                <w:rFonts w:ascii="Consolas" w:hAnsi="Consolas" w:eastAsia="Consolas"/>
+                <w:b w:val="0"/>
+                <w:i w:val="0"/>
+                <w:color w:val="222428"/>
+                <w:sz w:val="14"/>
+              </w:rPr>
+              <w:t>END;</w:t>
+              <w:br/>
+            </w:r>
+            <w:r>
+              <w:rPr>
+                <w:rFonts w:ascii="Consolas" w:hAnsi="Consolas" w:eastAsia="Consolas"/>
+                <w:b w:val="0"/>
+                <w:i w:val="0"/>
+                <w:color w:val="222428"/>
+                <w:sz w:val="14"/>
+              </w:rPr>
+              <w:t>/</w:t>
               <w:br/>
             </w:r>
             <w:r>
@@ -8171,7 +9139,62 @@
                 <w:color w:val="222428"/>
                 <w:sz w:val="14"/>
               </w:rPr>
-              <w:t>EXEC sp_cancel_booking(18);</w:t>
+              <w:t>BEGIN</w:t>
+              <w:br/>
+            </w:r>
+            <w:r>
+              <w:rPr>
+                <w:rFonts w:ascii="Consolas" w:hAnsi="Consolas" w:eastAsia="Consolas"/>
+                <w:b w:val="0"/>
+                <w:i w:val="0"/>
+                <w:color w:val="222428"/>
+                <w:sz w:val="14"/>
+              </w:rPr>
+              <w:t xml:space="preserve">  sp_cancel_booking(18);</w:t>
+              <w:br/>
+            </w:r>
+            <w:r>
+              <w:rPr>
+                <w:rFonts w:ascii="Consolas" w:hAnsi="Consolas" w:eastAsia="Consolas"/>
+                <w:b w:val="0"/>
+                <w:i w:val="0"/>
+                <w:color w:val="222428"/>
+                <w:sz w:val="14"/>
+              </w:rPr>
+              <w:t xml:space="preserve">  DBMS_OUTPUT.PUT_LINE('Accepted - rule NOT working');</w:t>
+              <w:br/>
+            </w:r>
+            <w:r>
+              <w:rPr>
+                <w:rFonts w:ascii="Consolas" w:hAnsi="Consolas" w:eastAsia="Consolas"/>
+                <w:b w:val="0"/>
+                <w:i w:val="0"/>
+                <w:color w:val="222428"/>
+                <w:sz w:val="14"/>
+              </w:rPr>
+              <w:t>EXCEPTION WHEN OTHERS THEN DBMS_OUTPUT.PUT_LINE('Rejected: ' || REGEXP_SUBSTR(SQLERRM, '[^' || CHR(10) || ']+'));</w:t>
+              <w:br/>
+            </w:r>
+            <w:r>
+              <w:rPr>
+                <w:rFonts w:ascii="Consolas" w:hAnsi="Consolas" w:eastAsia="Consolas"/>
+                <w:b w:val="0"/>
+                <w:i w:val="0"/>
+                <w:color w:val="222428"/>
+                <w:sz w:val="14"/>
+              </w:rPr>
+              <w:t>END;</w:t>
+              <w:br/>
+            </w:r>
+            <w:r>
+              <w:rPr>
+                <w:rFonts w:ascii="Consolas" w:hAnsi="Consolas" w:eastAsia="Consolas"/>
+                <w:b w:val="0"/>
+                <w:i w:val="0"/>
+                <w:color w:val="222428"/>
+                <w:sz w:val="14"/>
+              </w:rPr>
+              <w:t>/</w:t>
               <w:br/>
             </w:r>
             <w:r>
@@ -8193,7 +9216,62 @@
                 <w:color w:val="222428"/>
                 <w:sz w:val="14"/>
               </w:rPr>
-              <w:t>EXEC sp_register_customer('Aditya R', '9841000101', NULL, 'TN0920259999999', DATE '2036-01-01', DATE '1996-03-14');</w:t>
+              <w:t>BEGIN</w:t>
+              <w:br/>
+            </w:r>
+            <w:r>
+              <w:rPr>
+                <w:rFonts w:ascii="Consolas" w:hAnsi="Consolas" w:eastAsia="Consolas"/>
+                <w:b w:val="0"/>
+                <w:i w:val="0"/>
+                <w:color w:val="222428"/>
+                <w:sz w:val="14"/>
+              </w:rPr>
+              <w:t xml:space="preserve">  sp_register_customer('Aditya R', '9841000101', NULL, 'TN0920259999999', DATE '2036-01-01', DATE '1996-03-14');</w:t>
+              <w:br/>
+            </w:r>
+            <w:r>
+              <w:rPr>
+                <w:rFonts w:ascii="Consolas" w:hAnsi="Consolas" w:eastAsia="Consolas"/>
+                <w:b w:val="0"/>
+                <w:i w:val="0"/>
+                <w:color w:val="222428"/>
+                <w:sz w:val="14"/>
+              </w:rPr>
+              <w:t xml:space="preserve">  DBMS_OUTPUT.PUT_LINE('Accepted - rule NOT working');</w:t>
+              <w:br/>
+            </w:r>
+            <w:r>
+              <w:rPr>
+                <w:rFonts w:ascii="Consolas" w:hAnsi="Consolas" w:eastAsia="Consolas"/>
+                <w:b w:val="0"/>
+                <w:i w:val="0"/>
+                <w:color w:val="222428"/>
+                <w:sz w:val="14"/>
+              </w:rPr>
+              <w:t>EXCEPTION WHEN OTHERS THEN DBMS_OUTPUT.PUT_LINE('Rejected: ' || REGEXP_SUBSTR(SQLERRM, '[^' || CHR(10) || ']+'));</w:t>
+              <w:br/>
+            </w:r>
+            <w:r>
+              <w:rPr>
+                <w:rFonts w:ascii="Consolas" w:hAnsi="Consolas" w:eastAsia="Consolas"/>
+                <w:b w:val="0"/>
+                <w:i w:val="0"/>
+                <w:color w:val="222428"/>
+                <w:sz w:val="14"/>
+              </w:rPr>
+              <w:t>END;</w:t>
+              <w:br/>
+            </w:r>
+            <w:r>
+              <w:rPr>
+                <w:rFonts w:ascii="Consolas" w:hAnsi="Consolas" w:eastAsia="Consolas"/>
+                <w:b w:val="0"/>
+                <w:i w:val="0"/>
+                <w:color w:val="222428"/>
+                <w:sz w:val="14"/>
+              </w:rPr>
+              <w:t>/</w:t>
             </w:r>
           </w:p>
         </w:tc>

</xml_diff>